<commit_message>
fix: align tests with confirmed body boundaries
</commit_message>
<xml_diff>
--- a/tests/fixtures/synthetic/demo/known_issues_sample.docx
+++ b/tests/fixtures/synthetic/demo/known_issues_sample.docx
@@ -2,6 +2,14 @@
 <file path=word/document.xml><?xml version="1.0" encoding="utf-8"?>
 <w:document xmlns:w="http://schemas.openxmlformats.org/wordprocessingml/2006/main">
   <w:body>
+    <w:p>
+      <w:pPr>
+        <w:pStyle w:val="Heading1"/>
+      </w:pPr>
+      <w:r>
+        <w:t>第一章 绪论</w:t>
+      </w:r>
+    </w:p>
     <w:p>
       <w:r>
         <w:rPr>
@@ -19,7 +27,7 @@
           <w:sz w:val="24"/>
           <w:szCs w:val="24"/>
         </w:rPr>
-        <w:t>【问题2】西文字体不符合预期。</w:t>
+        <w:t>【问题2】Latin 西文字体不符合预期。</w:t>
       </w:r>
     </w:p>
     <w:p>
@@ -30,6 +38,14 @@
           <w:szCs w:val="21"/>
         </w:rPr>
         <w:t>【问题3】字号不符合预期。</w:t>
+      </w:r>
+    </w:p>
+    <w:p>
+      <w:pPr>
+        <w:pStyle w:val="Heading1"/>
+      </w:pPr>
+      <w:r>
+        <w:t>参考文献</w:t>
       </w:r>
     </w:p>
     <w:sectPr>

</xml_diff>